<commit_message>
Fix backend API URL and add environment variable to frontend deployment
</commit_message>
<xml_diff>
--- a/Project report deliverable.docx
+++ b/Project report deliverable.docx
@@ -13,10 +13,10 @@
     <w:p>
       <w:r>
         <w:drawing>
-          <wp:inline distT="0" distB="0" distL="0" distR="0" wp14:anchorId="3690B607" wp14:editId="16F31655">
-            <wp:extent cx="5731510" cy="2915285"/>
-            <wp:effectExtent l="19050" t="19050" r="21590" b="18415"/>
-            <wp:docPr id="1068625555" name="Picture 1"/>
+          <wp:inline distT="0" distB="0" distL="0" distR="0" wp14:anchorId="0E6FC06E" wp14:editId="3A73C3D6">
+            <wp:extent cx="5731510" cy="2814955"/>
+            <wp:effectExtent l="19050" t="19050" r="21590" b="23495"/>
+            <wp:docPr id="1423169217" name="Picture 1"/>
             <wp:cNvGraphicFramePr>
               <a:graphicFrameLocks xmlns:a="http://schemas.openxmlformats.org/drawingml/2006/main" noChangeAspect="1"/>
             </wp:cNvGraphicFramePr>
@@ -24,7 +24,7 @@
               <a:graphicData uri="http://schemas.openxmlformats.org/drawingml/2006/picture">
                 <pic:pic xmlns:pic="http://schemas.openxmlformats.org/drawingml/2006/picture">
                   <pic:nvPicPr>
-                    <pic:cNvPr id="1068625555" name=""/>
+                    <pic:cNvPr id="1423169217" name=""/>
                     <pic:cNvPicPr/>
                   </pic:nvPicPr>
                   <pic:blipFill>
@@ -36,7 +36,7 @@
                   <pic:spPr>
                     <a:xfrm>
                       <a:off x="0" y="0"/>
-                      <a:ext cx="5731510" cy="2915285"/>
+                      <a:ext cx="5731510" cy="2814955"/>
                     </a:xfrm>
                     <a:prstGeom prst="rect">
                       <a:avLst/>
@@ -65,10 +65,10 @@
     <w:p>
       <w:r>
         <w:drawing>
-          <wp:inline distT="0" distB="0" distL="0" distR="0" wp14:anchorId="5F0BD9D6" wp14:editId="1197F2D2">
-            <wp:extent cx="5731510" cy="1496695"/>
-            <wp:effectExtent l="19050" t="19050" r="21590" b="27305"/>
-            <wp:docPr id="1055243130" name="Picture 1"/>
+          <wp:inline distT="0" distB="0" distL="0" distR="0" wp14:anchorId="7FBFE6B9" wp14:editId="5A982805">
+            <wp:extent cx="5731510" cy="977265"/>
+            <wp:effectExtent l="19050" t="19050" r="21590" b="13335"/>
+            <wp:docPr id="289653675" name="Picture 1"/>
             <wp:cNvGraphicFramePr>
               <a:graphicFrameLocks xmlns:a="http://schemas.openxmlformats.org/drawingml/2006/main" noChangeAspect="1"/>
             </wp:cNvGraphicFramePr>
@@ -76,7 +76,7 @@
               <a:graphicData uri="http://schemas.openxmlformats.org/drawingml/2006/picture">
                 <pic:pic xmlns:pic="http://schemas.openxmlformats.org/drawingml/2006/picture">
                   <pic:nvPicPr>
-                    <pic:cNvPr id="1055243130" name=""/>
+                    <pic:cNvPr id="289653675" name=""/>
                     <pic:cNvPicPr/>
                   </pic:nvPicPr>
                   <pic:blipFill>
@@ -88,7 +88,7 @@
                   <pic:spPr>
                     <a:xfrm>
                       <a:off x="0" y="0"/>
-                      <a:ext cx="5731510" cy="1496695"/>
+                      <a:ext cx="5731510" cy="977265"/>
                     </a:xfrm>
                     <a:prstGeom prst="rect">
                       <a:avLst/>
@@ -117,10 +117,10 @@
     <w:p>
       <w:r>
         <w:drawing>
-          <wp:inline distT="0" distB="0" distL="0" distR="0" wp14:anchorId="367C982C" wp14:editId="529305F1">
-            <wp:extent cx="5731510" cy="461010"/>
-            <wp:effectExtent l="19050" t="19050" r="21590" b="15240"/>
-            <wp:docPr id="823820739" name="Picture 1"/>
+          <wp:inline distT="0" distB="0" distL="0" distR="0" wp14:anchorId="142B9255" wp14:editId="6265E148">
+            <wp:extent cx="5731510" cy="447675"/>
+            <wp:effectExtent l="19050" t="19050" r="21590" b="28575"/>
+            <wp:docPr id="1307046681" name="Picture 1"/>
             <wp:cNvGraphicFramePr>
               <a:graphicFrameLocks xmlns:a="http://schemas.openxmlformats.org/drawingml/2006/main" noChangeAspect="1"/>
             </wp:cNvGraphicFramePr>
@@ -128,7 +128,7 @@
               <a:graphicData uri="http://schemas.openxmlformats.org/drawingml/2006/picture">
                 <pic:pic xmlns:pic="http://schemas.openxmlformats.org/drawingml/2006/picture">
                   <pic:nvPicPr>
-                    <pic:cNvPr id="823820739" name=""/>
+                    <pic:cNvPr id="1307046681" name=""/>
                     <pic:cNvPicPr/>
                   </pic:nvPicPr>
                   <pic:blipFill>
@@ -140,7 +140,7 @@
                   <pic:spPr>
                     <a:xfrm>
                       <a:off x="0" y="0"/>
-                      <a:ext cx="5731510" cy="461010"/>
+                      <a:ext cx="5731510" cy="447675"/>
                     </a:xfrm>
                     <a:prstGeom prst="rect">
                       <a:avLst/>
@@ -175,10 +175,10 @@
     <w:p>
       <w:r>
         <w:drawing>
-          <wp:inline distT="0" distB="0" distL="0" distR="0" wp14:anchorId="780BB645" wp14:editId="37749E5E">
-            <wp:extent cx="5731510" cy="3183890"/>
-            <wp:effectExtent l="19050" t="19050" r="21590" b="16510"/>
-            <wp:docPr id="1410590832" name="Picture 1"/>
+          <wp:inline distT="0" distB="0" distL="0" distR="0" wp14:anchorId="0287FA12" wp14:editId="6F6E6855">
+            <wp:extent cx="5731510" cy="3176270"/>
+            <wp:effectExtent l="19050" t="19050" r="21590" b="24130"/>
+            <wp:docPr id="1818256347" name="Picture 1"/>
             <wp:cNvGraphicFramePr>
               <a:graphicFrameLocks xmlns:a="http://schemas.openxmlformats.org/drawingml/2006/main" noChangeAspect="1"/>
             </wp:cNvGraphicFramePr>
@@ -186,7 +186,7 @@
               <a:graphicData uri="http://schemas.openxmlformats.org/drawingml/2006/picture">
                 <pic:pic xmlns:pic="http://schemas.openxmlformats.org/drawingml/2006/picture">
                   <pic:nvPicPr>
-                    <pic:cNvPr id="1410590832" name=""/>
+                    <pic:cNvPr id="1818256347" name=""/>
                     <pic:cNvPicPr/>
                   </pic:nvPicPr>
                   <pic:blipFill>
@@ -198,7 +198,7 @@
                   <pic:spPr>
                     <a:xfrm>
                       <a:off x="0" y="0"/>
-                      <a:ext cx="5731510" cy="3183890"/>
+                      <a:ext cx="5731510" cy="3176270"/>
                     </a:xfrm>
                     <a:prstGeom prst="rect">
                       <a:avLst/>
@@ -227,10 +227,10 @@
     <w:p>
       <w:r>
         <w:drawing>
-          <wp:inline distT="0" distB="0" distL="0" distR="0" wp14:anchorId="5523166D" wp14:editId="4310E030">
-            <wp:extent cx="5731510" cy="3189605"/>
-            <wp:effectExtent l="19050" t="19050" r="21590" b="10795"/>
-            <wp:docPr id="969122605" name="Picture 1"/>
+          <wp:inline distT="0" distB="0" distL="0" distR="0" wp14:anchorId="71ED9D59" wp14:editId="1A1C6239">
+            <wp:extent cx="5731510" cy="3167380"/>
+            <wp:effectExtent l="19050" t="19050" r="21590" b="13970"/>
+            <wp:docPr id="1768318256" name="Picture 1"/>
             <wp:cNvGraphicFramePr>
               <a:graphicFrameLocks xmlns:a="http://schemas.openxmlformats.org/drawingml/2006/main" noChangeAspect="1"/>
             </wp:cNvGraphicFramePr>
@@ -238,7 +238,7 @@
               <a:graphicData uri="http://schemas.openxmlformats.org/drawingml/2006/picture">
                 <pic:pic xmlns:pic="http://schemas.openxmlformats.org/drawingml/2006/picture">
                   <pic:nvPicPr>
-                    <pic:cNvPr id="969122605" name=""/>
+                    <pic:cNvPr id="1768318256" name=""/>
                     <pic:cNvPicPr/>
                   </pic:nvPicPr>
                   <pic:blipFill>
@@ -250,7 +250,52 @@
                   <pic:spPr>
                     <a:xfrm>
                       <a:off x="0" y="0"/>
-                      <a:ext cx="5731510" cy="3189605"/>
+                      <a:ext cx="5731510" cy="3167380"/>
+                    </a:xfrm>
+                    <a:prstGeom prst="rect">
+                      <a:avLst/>
+                    </a:prstGeom>
+                    <a:ln>
+                      <a:solidFill>
+                        <a:schemeClr val="accent1"/>
+                      </a:solidFill>
+                    </a:ln>
+                  </pic:spPr>
+                </pic:pic>
+              </a:graphicData>
+            </a:graphic>
+          </wp:inline>
+        </w:drawing>
+      </w:r>
+    </w:p>
+    <w:p>
+      <w:r>
+        <w:lastRenderedPageBreak/>
+        <w:drawing>
+          <wp:inline distT="0" distB="0" distL="0" distR="0" wp14:anchorId="718516FF" wp14:editId="26AD8E4B">
+            <wp:extent cx="5731510" cy="3194685"/>
+            <wp:effectExtent l="19050" t="19050" r="21590" b="24765"/>
+            <wp:docPr id="1550055103" name="Picture 1"/>
+            <wp:cNvGraphicFramePr>
+              <a:graphicFrameLocks xmlns:a="http://schemas.openxmlformats.org/drawingml/2006/main" noChangeAspect="1"/>
+            </wp:cNvGraphicFramePr>
+            <a:graphic xmlns:a="http://schemas.openxmlformats.org/drawingml/2006/main">
+              <a:graphicData uri="http://schemas.openxmlformats.org/drawingml/2006/picture">
+                <pic:pic xmlns:pic="http://schemas.openxmlformats.org/drawingml/2006/picture">
+                  <pic:nvPicPr>
+                    <pic:cNvPr id="1550055103" name=""/>
+                    <pic:cNvPicPr/>
+                  </pic:nvPicPr>
+                  <pic:blipFill>
+                    <a:blip r:embed="rId9"/>
+                    <a:stretch>
+                      <a:fillRect/>
+                    </a:stretch>
+                  </pic:blipFill>
+                  <pic:spPr>
+                    <a:xfrm>
+                      <a:off x="0" y="0"/>
+                      <a:ext cx="5731510" cy="3194685"/>
                     </a:xfrm>
                     <a:prstGeom prst="rect">
                       <a:avLst/>
@@ -285,10 +330,10 @@
     <w:p>
       <w:r>
         <w:drawing>
-          <wp:inline distT="0" distB="0" distL="0" distR="0" wp14:anchorId="361B360B" wp14:editId="685BD30F">
-            <wp:extent cx="5731510" cy="3679190"/>
-            <wp:effectExtent l="19050" t="19050" r="21590" b="16510"/>
-            <wp:docPr id="756403810" name="Picture 1"/>
+          <wp:inline distT="0" distB="0" distL="0" distR="0" wp14:anchorId="5F621ACD" wp14:editId="20C07FCD">
+            <wp:extent cx="5731510" cy="4259580"/>
+            <wp:effectExtent l="19050" t="19050" r="21590" b="26670"/>
+            <wp:docPr id="1154543878" name="Picture 1"/>
             <wp:cNvGraphicFramePr>
               <a:graphicFrameLocks xmlns:a="http://schemas.openxmlformats.org/drawingml/2006/main" noChangeAspect="1"/>
             </wp:cNvGraphicFramePr>
@@ -296,11 +341,11 @@
               <a:graphicData uri="http://schemas.openxmlformats.org/drawingml/2006/picture">
                 <pic:pic xmlns:pic="http://schemas.openxmlformats.org/drawingml/2006/picture">
                   <pic:nvPicPr>
-                    <pic:cNvPr id="756403810" name=""/>
+                    <pic:cNvPr id="1154543878" name=""/>
                     <pic:cNvPicPr/>
                   </pic:nvPicPr>
                   <pic:blipFill>
-                    <a:blip r:embed="rId9"/>
+                    <a:blip r:embed="rId10"/>
                     <a:stretch>
                       <a:fillRect/>
                     </a:stretch>
@@ -308,7 +353,7 @@
                   <pic:spPr>
                     <a:xfrm>
                       <a:off x="0" y="0"/>
-                      <a:ext cx="5731510" cy="3679190"/>
+                      <a:ext cx="5731510" cy="4259580"/>
                     </a:xfrm>
                     <a:prstGeom prst="rect">
                       <a:avLst/>
@@ -329,10 +374,10 @@
     <w:p>
       <w:r>
         <w:drawing>
-          <wp:inline distT="0" distB="0" distL="0" distR="0" wp14:anchorId="7E7683FB" wp14:editId="130951BF">
-            <wp:extent cx="5731510" cy="675005"/>
-            <wp:effectExtent l="19050" t="19050" r="21590" b="10795"/>
-            <wp:docPr id="931250081" name="Picture 1"/>
+          <wp:inline distT="0" distB="0" distL="0" distR="0" wp14:anchorId="0DE2DD52" wp14:editId="33B8EFD7">
+            <wp:extent cx="5731510" cy="2852420"/>
+            <wp:effectExtent l="19050" t="19050" r="21590" b="24130"/>
+            <wp:docPr id="1723288101" name="Picture 1"/>
             <wp:cNvGraphicFramePr>
               <a:graphicFrameLocks xmlns:a="http://schemas.openxmlformats.org/drawingml/2006/main" noChangeAspect="1"/>
             </wp:cNvGraphicFramePr>
@@ -340,11 +385,11 @@
               <a:graphicData uri="http://schemas.openxmlformats.org/drawingml/2006/picture">
                 <pic:pic xmlns:pic="http://schemas.openxmlformats.org/drawingml/2006/picture">
                   <pic:nvPicPr>
-                    <pic:cNvPr id="931250081" name=""/>
+                    <pic:cNvPr id="1723288101" name=""/>
                     <pic:cNvPicPr/>
                   </pic:nvPicPr>
                   <pic:blipFill>
-                    <a:blip r:embed="rId10"/>
+                    <a:blip r:embed="rId11"/>
                     <a:stretch>
                       <a:fillRect/>
                     </a:stretch>
@@ -352,7 +397,52 @@
                   <pic:spPr>
                     <a:xfrm>
                       <a:off x="0" y="0"/>
-                      <a:ext cx="5731510" cy="675005"/>
+                      <a:ext cx="5731510" cy="2852420"/>
+                    </a:xfrm>
+                    <a:prstGeom prst="rect">
+                      <a:avLst/>
+                    </a:prstGeom>
+                    <a:ln>
+                      <a:solidFill>
+                        <a:schemeClr val="accent1"/>
+                      </a:solidFill>
+                    </a:ln>
+                  </pic:spPr>
+                </pic:pic>
+              </a:graphicData>
+            </a:graphic>
+          </wp:inline>
+        </w:drawing>
+      </w:r>
+    </w:p>
+    <w:p>
+      <w:r>
+        <w:lastRenderedPageBreak/>
+        <w:drawing>
+          <wp:inline distT="0" distB="0" distL="0" distR="0" wp14:anchorId="4E7C5C37" wp14:editId="1871D466">
+            <wp:extent cx="5731510" cy="1663700"/>
+            <wp:effectExtent l="19050" t="19050" r="21590" b="12700"/>
+            <wp:docPr id="1193206322" name="Picture 1"/>
+            <wp:cNvGraphicFramePr>
+              <a:graphicFrameLocks xmlns:a="http://schemas.openxmlformats.org/drawingml/2006/main" noChangeAspect="1"/>
+            </wp:cNvGraphicFramePr>
+            <a:graphic xmlns:a="http://schemas.openxmlformats.org/drawingml/2006/main">
+              <a:graphicData uri="http://schemas.openxmlformats.org/drawingml/2006/picture">
+                <pic:pic xmlns:pic="http://schemas.openxmlformats.org/drawingml/2006/picture">
+                  <pic:nvPicPr>
+                    <pic:cNvPr id="1193206322" name=""/>
+                    <pic:cNvPicPr/>
+                  </pic:nvPicPr>
+                  <pic:blipFill>
+                    <a:blip r:embed="rId12"/>
+                    <a:stretch>
+                      <a:fillRect/>
+                    </a:stretch>
+                  </pic:blipFill>
+                  <pic:spPr>
+                    <a:xfrm>
+                      <a:off x="0" y="0"/>
+                      <a:ext cx="5731510" cy="1663700"/>
                     </a:xfrm>
                     <a:prstGeom prst="rect">
                       <a:avLst/>
@@ -984,6 +1074,7 @@
   <w:style w:type="character" w:default="1" w:styleId="DefaultParagraphFont">
     <w:name w:val="Default Paragraph Font"/>
     <w:uiPriority w:val="1"/>
+    <w:semiHidden/>
     <w:unhideWhenUsed/>
   </w:style>
   <w:style w:type="table" w:default="1" w:styleId="TableNormal">

</xml_diff>

<commit_message>
Auto-fix frontend lint errors and update files
</commit_message>
<xml_diff>
--- a/Project report deliverable.docx
+++ b/Project report deliverable.docx
@@ -12,6 +12,9 @@
     </w:p>
     <w:p>
       <w:r>
+        <w:rPr>
+          <w:noProof/>
+        </w:rPr>
         <w:drawing>
           <wp:inline distT="0" distB="0" distL="0" distR="0" wp14:anchorId="0E6FC06E" wp14:editId="3A73C3D6">
             <wp:extent cx="5731510" cy="2814955"/>
@@ -28,7 +31,7 @@
                     <pic:cNvPicPr/>
                   </pic:nvPicPr>
                   <pic:blipFill>
-                    <a:blip r:embed="rId4"/>
+                    <a:blip r:embed="rId5"/>
                     <a:stretch>
                       <a:fillRect/>
                     </a:stretch>
@@ -55,6 +58,95 @@
       </w:r>
     </w:p>
     <w:p>
+      <w:r>
+        <w:drawing>
+          <wp:inline distT="0" distB="0" distL="0" distR="0" wp14:anchorId="39E63D82" wp14:editId="216D1FE0">
+            <wp:extent cx="5731510" cy="3409315"/>
+            <wp:effectExtent l="19050" t="19050" r="21590" b="19685"/>
+            <wp:docPr id="1326561486" name="Picture 1"/>
+            <wp:cNvGraphicFramePr>
+              <a:graphicFrameLocks xmlns:a="http://schemas.openxmlformats.org/drawingml/2006/main" noChangeAspect="1"/>
+            </wp:cNvGraphicFramePr>
+            <a:graphic xmlns:a="http://schemas.openxmlformats.org/drawingml/2006/main">
+              <a:graphicData uri="http://schemas.openxmlformats.org/drawingml/2006/picture">
+                <pic:pic xmlns:pic="http://schemas.openxmlformats.org/drawingml/2006/picture">
+                  <pic:nvPicPr>
+                    <pic:cNvPr id="1326561486" name=""/>
+                    <pic:cNvPicPr/>
+                  </pic:nvPicPr>
+                  <pic:blipFill>
+                    <a:blip r:embed="rId6"/>
+                    <a:stretch>
+                      <a:fillRect/>
+                    </a:stretch>
+                  </pic:blipFill>
+                  <pic:spPr>
+                    <a:xfrm>
+                      <a:off x="0" y="0"/>
+                      <a:ext cx="5731510" cy="3409315"/>
+                    </a:xfrm>
+                    <a:prstGeom prst="rect">
+                      <a:avLst/>
+                    </a:prstGeom>
+                    <a:ln>
+                      <a:solidFill>
+                        <a:schemeClr val="accent1"/>
+                      </a:solidFill>
+                    </a:ln>
+                  </pic:spPr>
+                </pic:pic>
+              </a:graphicData>
+            </a:graphic>
+          </wp:inline>
+        </w:drawing>
+      </w:r>
+    </w:p>
+    <w:p>
+      <w:r>
+        <w:lastRenderedPageBreak/>
+        <w:drawing>
+          <wp:inline distT="0" distB="0" distL="0" distR="0" wp14:anchorId="06BA2196" wp14:editId="34A41604">
+            <wp:extent cx="5731510" cy="3391535"/>
+            <wp:effectExtent l="19050" t="19050" r="21590" b="18415"/>
+            <wp:docPr id="28718827" name="Picture 1"/>
+            <wp:cNvGraphicFramePr>
+              <a:graphicFrameLocks xmlns:a="http://schemas.openxmlformats.org/drawingml/2006/main" noChangeAspect="1"/>
+            </wp:cNvGraphicFramePr>
+            <a:graphic xmlns:a="http://schemas.openxmlformats.org/drawingml/2006/main">
+              <a:graphicData uri="http://schemas.openxmlformats.org/drawingml/2006/picture">
+                <pic:pic xmlns:pic="http://schemas.openxmlformats.org/drawingml/2006/picture">
+                  <pic:nvPicPr>
+                    <pic:cNvPr id="28718827" name=""/>
+                    <pic:cNvPicPr/>
+                  </pic:nvPicPr>
+                  <pic:blipFill>
+                    <a:blip r:embed="rId7"/>
+                    <a:stretch>
+                      <a:fillRect/>
+                    </a:stretch>
+                  </pic:blipFill>
+                  <pic:spPr>
+                    <a:xfrm>
+                      <a:off x="0" y="0"/>
+                      <a:ext cx="5731510" cy="3391535"/>
+                    </a:xfrm>
+                    <a:prstGeom prst="rect">
+                      <a:avLst/>
+                    </a:prstGeom>
+                    <a:ln>
+                      <a:solidFill>
+                        <a:schemeClr val="accent1"/>
+                      </a:solidFill>
+                    </a:ln>
+                  </pic:spPr>
+                </pic:pic>
+              </a:graphicData>
+            </a:graphic>
+          </wp:inline>
+        </w:drawing>
+      </w:r>
+    </w:p>
+    <w:p>
       <w:pPr>
         <w:pStyle w:val="Heading1"/>
       </w:pPr>
@@ -64,6 +156,9 @@
     </w:p>
     <w:p>
       <w:r>
+        <w:rPr>
+          <w:noProof/>
+        </w:rPr>
         <w:drawing>
           <wp:inline distT="0" distB="0" distL="0" distR="0" wp14:anchorId="7FBFE6B9" wp14:editId="5A982805">
             <wp:extent cx="5731510" cy="977265"/>
@@ -80,7 +175,7 @@
                     <pic:cNvPicPr/>
                   </pic:nvPicPr>
                   <pic:blipFill>
-                    <a:blip r:embed="rId5"/>
+                    <a:blip r:embed="rId8"/>
                     <a:stretch>
                       <a:fillRect/>
                     </a:stretch>
@@ -116,6 +211,9 @@
     </w:p>
     <w:p>
       <w:r>
+        <w:rPr>
+          <w:noProof/>
+        </w:rPr>
         <w:drawing>
           <wp:inline distT="0" distB="0" distL="0" distR="0" wp14:anchorId="142B9255" wp14:editId="6265E148">
             <wp:extent cx="5731510" cy="447675"/>
@@ -132,7 +230,7 @@
                     <pic:cNvPicPr/>
                   </pic:nvPicPr>
                   <pic:blipFill>
-                    <a:blip r:embed="rId6"/>
+                    <a:blip r:embed="rId9"/>
                     <a:stretch>
                       <a:fillRect/>
                     </a:stretch>
@@ -175,10 +273,10 @@
     <w:p>
       <w:r>
         <w:drawing>
-          <wp:inline distT="0" distB="0" distL="0" distR="0" wp14:anchorId="0287FA12" wp14:editId="6F6E6855">
-            <wp:extent cx="5731510" cy="3176270"/>
-            <wp:effectExtent l="19050" t="19050" r="21590" b="24130"/>
-            <wp:docPr id="1818256347" name="Picture 1"/>
+          <wp:inline distT="0" distB="0" distL="0" distR="0" wp14:anchorId="52E79FBA" wp14:editId="2B40C2AC">
+            <wp:extent cx="5731510" cy="3580130"/>
+            <wp:effectExtent l="19050" t="19050" r="21590" b="20320"/>
+            <wp:docPr id="1061323295" name="Picture 1"/>
             <wp:cNvGraphicFramePr>
               <a:graphicFrameLocks xmlns:a="http://schemas.openxmlformats.org/drawingml/2006/main" noChangeAspect="1"/>
             </wp:cNvGraphicFramePr>
@@ -186,11 +284,11 @@
               <a:graphicData uri="http://schemas.openxmlformats.org/drawingml/2006/picture">
                 <pic:pic xmlns:pic="http://schemas.openxmlformats.org/drawingml/2006/picture">
                   <pic:nvPicPr>
-                    <pic:cNvPr id="1818256347" name=""/>
+                    <pic:cNvPr id="1061323295" name=""/>
                     <pic:cNvPicPr/>
                   </pic:nvPicPr>
                   <pic:blipFill>
-                    <a:blip r:embed="rId7"/>
+                    <a:blip r:embed="rId10"/>
                     <a:stretch>
                       <a:fillRect/>
                     </a:stretch>
@@ -198,7 +296,7 @@
                   <pic:spPr>
                     <a:xfrm>
                       <a:off x="0" y="0"/>
-                      <a:ext cx="5731510" cy="3176270"/>
+                      <a:ext cx="5731510" cy="3580130"/>
                     </a:xfrm>
                     <a:prstGeom prst="rect">
                       <a:avLst/>
@@ -217,20 +315,12 @@
       </w:r>
     </w:p>
     <w:p>
-      <w:pPr>
-        <w:pStyle w:val="Heading1"/>
-      </w:pPr>
-      <w:r>
-        <w:t>Frontend Web Application:</w:t>
-      </w:r>
-    </w:p>
-    <w:p>
       <w:r>
         <w:drawing>
-          <wp:inline distT="0" distB="0" distL="0" distR="0" wp14:anchorId="71ED9D59" wp14:editId="1A1C6239">
-            <wp:extent cx="5731510" cy="3167380"/>
-            <wp:effectExtent l="19050" t="19050" r="21590" b="13970"/>
-            <wp:docPr id="1768318256" name="Picture 1"/>
+          <wp:inline distT="0" distB="0" distL="0" distR="0" wp14:anchorId="697E4D72" wp14:editId="4AFF9D5F">
+            <wp:extent cx="5731510" cy="3041015"/>
+            <wp:effectExtent l="19050" t="19050" r="21590" b="26035"/>
+            <wp:docPr id="2138924748" name="Picture 1"/>
             <wp:cNvGraphicFramePr>
               <a:graphicFrameLocks xmlns:a="http://schemas.openxmlformats.org/drawingml/2006/main" noChangeAspect="1"/>
             </wp:cNvGraphicFramePr>
@@ -238,11 +328,11 @@
               <a:graphicData uri="http://schemas.openxmlformats.org/drawingml/2006/picture">
                 <pic:pic xmlns:pic="http://schemas.openxmlformats.org/drawingml/2006/picture">
                   <pic:nvPicPr>
-                    <pic:cNvPr id="1768318256" name=""/>
+                    <pic:cNvPr id="528784071" name=""/>
                     <pic:cNvPicPr/>
                   </pic:nvPicPr>
                   <pic:blipFill>
-                    <a:blip r:embed="rId8"/>
+                    <a:blip r:embed="rId11"/>
                     <a:stretch>
                       <a:fillRect/>
                     </a:stretch>
@@ -250,7 +340,7 @@
                   <pic:spPr>
                     <a:xfrm>
                       <a:off x="0" y="0"/>
-                      <a:ext cx="5731510" cy="3167380"/>
+                      <a:ext cx="5731510" cy="3041015"/>
                     </a:xfrm>
                     <a:prstGeom prst="rect">
                       <a:avLst/>
@@ -272,10 +362,10 @@
       <w:r>
         <w:lastRenderedPageBreak/>
         <w:drawing>
-          <wp:inline distT="0" distB="0" distL="0" distR="0" wp14:anchorId="718516FF" wp14:editId="26AD8E4B">
-            <wp:extent cx="5731510" cy="3194685"/>
-            <wp:effectExtent l="19050" t="19050" r="21590" b="24765"/>
-            <wp:docPr id="1550055103" name="Picture 1"/>
+          <wp:inline distT="0" distB="0" distL="0" distR="0" wp14:anchorId="1516814D" wp14:editId="6D3E1BE3">
+            <wp:extent cx="5731510" cy="3580130"/>
+            <wp:effectExtent l="19050" t="19050" r="21590" b="20320"/>
+            <wp:docPr id="911595703" name="Picture 1"/>
             <wp:cNvGraphicFramePr>
               <a:graphicFrameLocks xmlns:a="http://schemas.openxmlformats.org/drawingml/2006/main" noChangeAspect="1"/>
             </wp:cNvGraphicFramePr>
@@ -283,11 +373,11 @@
               <a:graphicData uri="http://schemas.openxmlformats.org/drawingml/2006/picture">
                 <pic:pic xmlns:pic="http://schemas.openxmlformats.org/drawingml/2006/picture">
                   <pic:nvPicPr>
-                    <pic:cNvPr id="1550055103" name=""/>
+                    <pic:cNvPr id="911595703" name=""/>
                     <pic:cNvPicPr/>
                   </pic:nvPicPr>
                   <pic:blipFill>
-                    <a:blip r:embed="rId9"/>
+                    <a:blip r:embed="rId12"/>
                     <a:stretch>
                       <a:fillRect/>
                     </a:stretch>
@@ -295,7 +385,105 @@
                   <pic:spPr>
                     <a:xfrm>
                       <a:off x="0" y="0"/>
-                      <a:ext cx="5731510" cy="3194685"/>
+                      <a:ext cx="5731510" cy="3580130"/>
+                    </a:xfrm>
+                    <a:prstGeom prst="rect">
+                      <a:avLst/>
+                    </a:prstGeom>
+                    <a:ln>
+                      <a:solidFill>
+                        <a:schemeClr val="accent1"/>
+                      </a:solidFill>
+                    </a:ln>
+                  </pic:spPr>
+                </pic:pic>
+              </a:graphicData>
+            </a:graphic>
+          </wp:inline>
+        </w:drawing>
+      </w:r>
+    </w:p>
+    <w:p>
+      <w:pPr>
+        <w:pStyle w:val="Heading1"/>
+      </w:pPr>
+      <w:r>
+        <w:t>Frontend Web Application:</w:t>
+      </w:r>
+    </w:p>
+    <w:p>
+      <w:r>
+        <w:drawing>
+          <wp:inline distT="0" distB="0" distL="0" distR="0" wp14:anchorId="0EF9ADEC" wp14:editId="3663F718">
+            <wp:extent cx="5731510" cy="3580130"/>
+            <wp:effectExtent l="19050" t="19050" r="21590" b="20320"/>
+            <wp:docPr id="841328632" name="Picture 1"/>
+            <wp:cNvGraphicFramePr>
+              <a:graphicFrameLocks xmlns:a="http://schemas.openxmlformats.org/drawingml/2006/main" noChangeAspect="1"/>
+            </wp:cNvGraphicFramePr>
+            <a:graphic xmlns:a="http://schemas.openxmlformats.org/drawingml/2006/main">
+              <a:graphicData uri="http://schemas.openxmlformats.org/drawingml/2006/picture">
+                <pic:pic xmlns:pic="http://schemas.openxmlformats.org/drawingml/2006/picture">
+                  <pic:nvPicPr>
+                    <pic:cNvPr id="841328632" name=""/>
+                    <pic:cNvPicPr/>
+                  </pic:nvPicPr>
+                  <pic:blipFill>
+                    <a:blip r:embed="rId13"/>
+                    <a:stretch>
+                      <a:fillRect/>
+                    </a:stretch>
+                  </pic:blipFill>
+                  <pic:spPr>
+                    <a:xfrm>
+                      <a:off x="0" y="0"/>
+                      <a:ext cx="5731510" cy="3580130"/>
+                    </a:xfrm>
+                    <a:prstGeom prst="rect">
+                      <a:avLst/>
+                    </a:prstGeom>
+                    <a:ln>
+                      <a:solidFill>
+                        <a:schemeClr val="accent1"/>
+                      </a:solidFill>
+                    </a:ln>
+                  </pic:spPr>
+                </pic:pic>
+              </a:graphicData>
+            </a:graphic>
+          </wp:inline>
+        </w:drawing>
+      </w:r>
+    </w:p>
+    <w:p/>
+    <w:p>
+      <w:r>
+        <w:lastRenderedPageBreak/>
+        <w:drawing>
+          <wp:inline distT="0" distB="0" distL="0" distR="0" wp14:anchorId="63474B22" wp14:editId="2135C1FC">
+            <wp:extent cx="5731510" cy="3580130"/>
+            <wp:effectExtent l="19050" t="19050" r="21590" b="20320"/>
+            <wp:docPr id="99953310" name="Picture 1"/>
+            <wp:cNvGraphicFramePr>
+              <a:graphicFrameLocks xmlns:a="http://schemas.openxmlformats.org/drawingml/2006/main" noChangeAspect="1"/>
+            </wp:cNvGraphicFramePr>
+            <a:graphic xmlns:a="http://schemas.openxmlformats.org/drawingml/2006/main">
+              <a:graphicData uri="http://schemas.openxmlformats.org/drawingml/2006/picture">
+                <pic:pic xmlns:pic="http://schemas.openxmlformats.org/drawingml/2006/picture">
+                  <pic:nvPicPr>
+                    <pic:cNvPr id="99953310" name=""/>
+                    <pic:cNvPicPr/>
+                  </pic:nvPicPr>
+                  <pic:blipFill>
+                    <a:blip r:embed="rId14"/>
+                    <a:stretch>
+                      <a:fillRect/>
+                    </a:stretch>
+                  </pic:blipFill>
+                  <pic:spPr>
+                    <a:xfrm>
+                      <a:off x="0" y="0"/>
+                      <a:ext cx="5731510" cy="3580130"/>
                     </a:xfrm>
                     <a:prstGeom prst="rect">
                       <a:avLst/>
@@ -315,6 +503,93 @@
     </w:p>
     <w:p>
       <w:r>
+        <w:drawing>
+          <wp:inline distT="0" distB="0" distL="0" distR="0" wp14:anchorId="7A0021B7" wp14:editId="396172BA">
+            <wp:extent cx="5731510" cy="3041015"/>
+            <wp:effectExtent l="19050" t="19050" r="21590" b="26035"/>
+            <wp:docPr id="528784071" name="Picture 1"/>
+            <wp:cNvGraphicFramePr>
+              <a:graphicFrameLocks xmlns:a="http://schemas.openxmlformats.org/drawingml/2006/main" noChangeAspect="1"/>
+            </wp:cNvGraphicFramePr>
+            <a:graphic xmlns:a="http://schemas.openxmlformats.org/drawingml/2006/main">
+              <a:graphicData uri="http://schemas.openxmlformats.org/drawingml/2006/picture">
+                <pic:pic xmlns:pic="http://schemas.openxmlformats.org/drawingml/2006/picture">
+                  <pic:nvPicPr>
+                    <pic:cNvPr id="528784071" name=""/>
+                    <pic:cNvPicPr/>
+                  </pic:nvPicPr>
+                  <pic:blipFill>
+                    <a:blip r:embed="rId11"/>
+                    <a:stretch>
+                      <a:fillRect/>
+                    </a:stretch>
+                  </pic:blipFill>
+                  <pic:spPr>
+                    <a:xfrm>
+                      <a:off x="0" y="0"/>
+                      <a:ext cx="5731510" cy="3041015"/>
+                    </a:xfrm>
+                    <a:prstGeom prst="rect">
+                      <a:avLst/>
+                    </a:prstGeom>
+                    <a:ln>
+                      <a:solidFill>
+                        <a:schemeClr val="accent1"/>
+                      </a:solidFill>
+                    </a:ln>
+                  </pic:spPr>
+                </pic:pic>
+              </a:graphicData>
+            </a:graphic>
+          </wp:inline>
+        </w:drawing>
+      </w:r>
+    </w:p>
+    <w:p>
+      <w:r>
+        <w:lastRenderedPageBreak/>
+        <w:drawing>
+          <wp:inline distT="0" distB="0" distL="0" distR="0" wp14:anchorId="1FCBE05D" wp14:editId="52E45FCF">
+            <wp:extent cx="5731510" cy="3409315"/>
+            <wp:effectExtent l="19050" t="19050" r="21590" b="19685"/>
+            <wp:docPr id="992668970" name="Picture 1"/>
+            <wp:cNvGraphicFramePr>
+              <a:graphicFrameLocks xmlns:a="http://schemas.openxmlformats.org/drawingml/2006/main" noChangeAspect="1"/>
+            </wp:cNvGraphicFramePr>
+            <a:graphic xmlns:a="http://schemas.openxmlformats.org/drawingml/2006/main">
+              <a:graphicData uri="http://schemas.openxmlformats.org/drawingml/2006/picture">
+                <pic:pic xmlns:pic="http://schemas.openxmlformats.org/drawingml/2006/picture">
+                  <pic:nvPicPr>
+                    <pic:cNvPr id="992668970" name=""/>
+                    <pic:cNvPicPr/>
+                  </pic:nvPicPr>
+                  <pic:blipFill>
+                    <a:blip r:embed="rId15"/>
+                    <a:stretch>
+                      <a:fillRect/>
+                    </a:stretch>
+                  </pic:blipFill>
+                  <pic:spPr>
+                    <a:xfrm>
+                      <a:off x="0" y="0"/>
+                      <a:ext cx="5731510" cy="3409315"/>
+                    </a:xfrm>
+                    <a:prstGeom prst="rect">
+                      <a:avLst/>
+                    </a:prstGeom>
+                    <a:ln>
+                      <a:solidFill>
+                        <a:schemeClr val="accent1"/>
+                      </a:solidFill>
+                    </a:ln>
+                  </pic:spPr>
+                </pic:pic>
+              </a:graphicData>
+            </a:graphic>
+          </wp:inline>
+        </w:drawing>
+      </w:r>
+      <w:r>
         <w:br w:type="page"/>
       </w:r>
     </w:p>
@@ -329,6 +604,9 @@
     </w:p>
     <w:p>
       <w:r>
+        <w:rPr>
+          <w:noProof/>
+        </w:rPr>
         <w:drawing>
           <wp:inline distT="0" distB="0" distL="0" distR="0" wp14:anchorId="5F621ACD" wp14:editId="20C07FCD">
             <wp:extent cx="5731510" cy="4259580"/>
@@ -345,7 +623,7 @@
                     <pic:cNvPicPr/>
                   </pic:nvPicPr>
                   <pic:blipFill>
-                    <a:blip r:embed="rId10"/>
+                    <a:blip r:embed="rId16"/>
                     <a:stretch>
                       <a:fillRect/>
                     </a:stretch>
@@ -373,6 +651,9 @@
     </w:p>
     <w:p>
       <w:r>
+        <w:rPr>
+          <w:noProof/>
+        </w:rPr>
         <w:drawing>
           <wp:inline distT="0" distB="0" distL="0" distR="0" wp14:anchorId="0DE2DD52" wp14:editId="33B8EFD7">
             <wp:extent cx="5731510" cy="2852420"/>
@@ -389,7 +670,7 @@
                     <pic:cNvPicPr/>
                   </pic:nvPicPr>
                   <pic:blipFill>
-                    <a:blip r:embed="rId11"/>
+                    <a:blip r:embed="rId17"/>
                     <a:stretch>
                       <a:fillRect/>
                     </a:stretch>
@@ -417,6 +698,9 @@
     </w:p>
     <w:p>
       <w:r>
+        <w:rPr>
+          <w:noProof/>
+        </w:rPr>
         <w:lastRenderedPageBreak/>
         <w:drawing>
           <wp:inline distT="0" distB="0" distL="0" distR="0" wp14:anchorId="4E7C5C37" wp14:editId="1871D466">
@@ -434,7 +718,7 @@
                     <pic:cNvPicPr/>
                   </pic:nvPicPr>
                   <pic:blipFill>
-                    <a:blip r:embed="rId12"/>
+                    <a:blip r:embed="rId18"/>
                     <a:stretch>
                       <a:fillRect/>
                     </a:stretch>
@@ -469,6 +753,395 @@
     </w:sectPr>
   </w:body>
 </w:document>
+</file>
+
+<file path=word/numbering.xml><?xml version="1.0" encoding="utf-8"?>
+<w:numbering xmlns:wpc="http://schemas.microsoft.com/office/word/2010/wordprocessingCanvas" xmlns:cx="http://schemas.microsoft.com/office/drawing/2014/chartex" xmlns:cx1="http://schemas.microsoft.com/office/drawing/2015/9/8/chartex" xmlns:cx2="http://schemas.microsoft.com/office/drawing/2015/10/21/chartex" xmlns:cx3="http://schemas.microsoft.com/office/drawing/2016/5/9/chartex" xmlns:cx4="http://schemas.microsoft.com/office/drawing/2016/5/10/chartex" xmlns:cx5="http://schemas.microsoft.com/office/drawing/2016/5/11/chartex" xmlns:cx6="http://schemas.microsoft.com/office/drawing/2016/5/12/chartex" xmlns:cx7="http://schemas.microsoft.com/office/drawing/2016/5/13/chartex" xmlns:cx8="http://schemas.microsoft.com/office/drawing/2016/5/14/chartex" xmlns:mc="http://schemas.openxmlformats.org/markup-compatibility/2006" xmlns:aink="http://schemas.microsoft.com/office/drawing/2016/ink" xmlns:am3d="http://schemas.microsoft.com/office/drawing/2017/model3d" xmlns:o="urn:schemas-microsoft-com:office:office" xmlns:oel="http://schemas.microsoft.com/office/2019/extlst" xmlns:r="http://schemas.openxmlformats.org/officeDocument/2006/relationships" xmlns:m="http://schemas.openxmlformats.org/officeDocument/2006/math" xmlns:v="urn:schemas-microsoft-com:vml" xmlns:wp14="http://schemas.microsoft.com/office/word/2010/wordprocessingDrawing" xmlns:wp="http://schemas.openxmlformats.org/drawingml/2006/wordprocessingDrawing" xmlns:w10="urn:schemas-microsoft-com:office:word" xmlns:w="http://schemas.openxmlformats.org/wordprocessingml/2006/main" xmlns:w14="http://schemas.microsoft.com/office/word/2010/wordml" xmlns:w15="http://schemas.microsoft.com/office/word/2012/wordml" xmlns:w16cex="http://schemas.microsoft.com/office/word/2018/wordml/cex" xmlns:w16cid="http://schemas.microsoft.com/office/word/2016/wordml/cid" xmlns:w16="http://schemas.microsoft.com/office/word/2018/wordml" xmlns:w16du="http://schemas.microsoft.com/office/word/2023/wordml/word16du" xmlns:w16sdtdh="http://schemas.microsoft.com/office/word/2020/wordml/sdtdatahash" xmlns:w16sdtfl="http://schemas.microsoft.com/office/word/2024/wordml/sdtformatlock" xmlns:w16se="http://schemas.microsoft.com/office/word/2015/wordml/symex" xmlns:wpg="http://schemas.microsoft.com/office/word/2010/wordprocessingGroup" xmlns:wpi="http://schemas.microsoft.com/office/word/2010/wordprocessingInk" xmlns:wne="http://schemas.microsoft.com/office/word/2006/wordml" xmlns:wps="http://schemas.microsoft.com/office/word/2010/wordprocessingShape" mc:Ignorable="w14 w15 w16se w16cid w16 w16cex w16sdtdh w16sdtfl w16du wp14">
+  <w:abstractNum w:abstractNumId="0" w15:restartNumberingAfterBreak="0">
+    <w:nsid w:val="04916962"/>
+    <w:multiLevelType w:val="multilevel"/>
+    <w:tmpl w:val="3604A2F6"/>
+    <w:lvl w:ilvl="0">
+      <w:start w:val="1"/>
+      <w:numFmt w:val="decimal"/>
+      <w:lvlText w:val="%1."/>
+      <w:lvlJc w:val="left"/>
+      <w:pPr>
+        <w:tabs>
+          <w:tab w:val="num" w:pos="720"/>
+        </w:tabs>
+        <w:ind w:left="720" w:hanging="360"/>
+      </w:pPr>
+    </w:lvl>
+    <w:lvl w:ilvl="1" w:tentative="1">
+      <w:start w:val="1"/>
+      <w:numFmt w:val="decimal"/>
+      <w:lvlText w:val="%2."/>
+      <w:lvlJc w:val="left"/>
+      <w:pPr>
+        <w:tabs>
+          <w:tab w:val="num" w:pos="1440"/>
+        </w:tabs>
+        <w:ind w:left="1440" w:hanging="360"/>
+      </w:pPr>
+    </w:lvl>
+    <w:lvl w:ilvl="2" w:tentative="1">
+      <w:start w:val="1"/>
+      <w:numFmt w:val="decimal"/>
+      <w:lvlText w:val="%3."/>
+      <w:lvlJc w:val="left"/>
+      <w:pPr>
+        <w:tabs>
+          <w:tab w:val="num" w:pos="2160"/>
+        </w:tabs>
+        <w:ind w:left="2160" w:hanging="360"/>
+      </w:pPr>
+    </w:lvl>
+    <w:lvl w:ilvl="3" w:tentative="1">
+      <w:start w:val="1"/>
+      <w:numFmt w:val="decimal"/>
+      <w:lvlText w:val="%4."/>
+      <w:lvlJc w:val="left"/>
+      <w:pPr>
+        <w:tabs>
+          <w:tab w:val="num" w:pos="2880"/>
+        </w:tabs>
+        <w:ind w:left="2880" w:hanging="360"/>
+      </w:pPr>
+    </w:lvl>
+    <w:lvl w:ilvl="4" w:tentative="1">
+      <w:start w:val="1"/>
+      <w:numFmt w:val="decimal"/>
+      <w:lvlText w:val="%5."/>
+      <w:lvlJc w:val="left"/>
+      <w:pPr>
+        <w:tabs>
+          <w:tab w:val="num" w:pos="3600"/>
+        </w:tabs>
+        <w:ind w:left="3600" w:hanging="360"/>
+      </w:pPr>
+    </w:lvl>
+    <w:lvl w:ilvl="5" w:tentative="1">
+      <w:start w:val="1"/>
+      <w:numFmt w:val="decimal"/>
+      <w:lvlText w:val="%6."/>
+      <w:lvlJc w:val="left"/>
+      <w:pPr>
+        <w:tabs>
+          <w:tab w:val="num" w:pos="4320"/>
+        </w:tabs>
+        <w:ind w:left="4320" w:hanging="360"/>
+      </w:pPr>
+    </w:lvl>
+    <w:lvl w:ilvl="6" w:tentative="1">
+      <w:start w:val="1"/>
+      <w:numFmt w:val="decimal"/>
+      <w:lvlText w:val="%7."/>
+      <w:lvlJc w:val="left"/>
+      <w:pPr>
+        <w:tabs>
+          <w:tab w:val="num" w:pos="5040"/>
+        </w:tabs>
+        <w:ind w:left="5040" w:hanging="360"/>
+      </w:pPr>
+    </w:lvl>
+    <w:lvl w:ilvl="7" w:tentative="1">
+      <w:start w:val="1"/>
+      <w:numFmt w:val="decimal"/>
+      <w:lvlText w:val="%8."/>
+      <w:lvlJc w:val="left"/>
+      <w:pPr>
+        <w:tabs>
+          <w:tab w:val="num" w:pos="5760"/>
+        </w:tabs>
+        <w:ind w:left="5760" w:hanging="360"/>
+      </w:pPr>
+    </w:lvl>
+    <w:lvl w:ilvl="8" w:tentative="1">
+      <w:start w:val="1"/>
+      <w:numFmt w:val="decimal"/>
+      <w:lvlText w:val="%9."/>
+      <w:lvlJc w:val="left"/>
+      <w:pPr>
+        <w:tabs>
+          <w:tab w:val="num" w:pos="6480"/>
+        </w:tabs>
+        <w:ind w:left="6480" w:hanging="360"/>
+      </w:pPr>
+    </w:lvl>
+  </w:abstractNum>
+  <w:abstractNum w:abstractNumId="1" w15:restartNumberingAfterBreak="0">
+    <w:nsid w:val="209A7AC8"/>
+    <w:multiLevelType w:val="multilevel"/>
+    <w:tmpl w:val="16785F1A"/>
+    <w:lvl w:ilvl="0">
+      <w:start w:val="1"/>
+      <w:numFmt w:val="decimal"/>
+      <w:lvlText w:val="%1."/>
+      <w:lvlJc w:val="left"/>
+      <w:pPr>
+        <w:tabs>
+          <w:tab w:val="num" w:pos="720"/>
+        </w:tabs>
+        <w:ind w:left="720" w:hanging="360"/>
+      </w:pPr>
+    </w:lvl>
+    <w:lvl w:ilvl="1" w:tentative="1">
+      <w:start w:val="1"/>
+      <w:numFmt w:val="decimal"/>
+      <w:lvlText w:val="%2."/>
+      <w:lvlJc w:val="left"/>
+      <w:pPr>
+        <w:tabs>
+          <w:tab w:val="num" w:pos="1440"/>
+        </w:tabs>
+        <w:ind w:left="1440" w:hanging="360"/>
+      </w:pPr>
+    </w:lvl>
+    <w:lvl w:ilvl="2" w:tentative="1">
+      <w:start w:val="1"/>
+      <w:numFmt w:val="decimal"/>
+      <w:lvlText w:val="%3."/>
+      <w:lvlJc w:val="left"/>
+      <w:pPr>
+        <w:tabs>
+          <w:tab w:val="num" w:pos="2160"/>
+        </w:tabs>
+        <w:ind w:left="2160" w:hanging="360"/>
+      </w:pPr>
+    </w:lvl>
+    <w:lvl w:ilvl="3" w:tentative="1">
+      <w:start w:val="1"/>
+      <w:numFmt w:val="decimal"/>
+      <w:lvlText w:val="%4."/>
+      <w:lvlJc w:val="left"/>
+      <w:pPr>
+        <w:tabs>
+          <w:tab w:val="num" w:pos="2880"/>
+        </w:tabs>
+        <w:ind w:left="2880" w:hanging="360"/>
+      </w:pPr>
+    </w:lvl>
+    <w:lvl w:ilvl="4" w:tentative="1">
+      <w:start w:val="1"/>
+      <w:numFmt w:val="decimal"/>
+      <w:lvlText w:val="%5."/>
+      <w:lvlJc w:val="left"/>
+      <w:pPr>
+        <w:tabs>
+          <w:tab w:val="num" w:pos="3600"/>
+        </w:tabs>
+        <w:ind w:left="3600" w:hanging="360"/>
+      </w:pPr>
+    </w:lvl>
+    <w:lvl w:ilvl="5" w:tentative="1">
+      <w:start w:val="1"/>
+      <w:numFmt w:val="decimal"/>
+      <w:lvlText w:val="%6."/>
+      <w:lvlJc w:val="left"/>
+      <w:pPr>
+        <w:tabs>
+          <w:tab w:val="num" w:pos="4320"/>
+        </w:tabs>
+        <w:ind w:left="4320" w:hanging="360"/>
+      </w:pPr>
+    </w:lvl>
+    <w:lvl w:ilvl="6" w:tentative="1">
+      <w:start w:val="1"/>
+      <w:numFmt w:val="decimal"/>
+      <w:lvlText w:val="%7."/>
+      <w:lvlJc w:val="left"/>
+      <w:pPr>
+        <w:tabs>
+          <w:tab w:val="num" w:pos="5040"/>
+        </w:tabs>
+        <w:ind w:left="5040" w:hanging="360"/>
+      </w:pPr>
+    </w:lvl>
+    <w:lvl w:ilvl="7" w:tentative="1">
+      <w:start w:val="1"/>
+      <w:numFmt w:val="decimal"/>
+      <w:lvlText w:val="%8."/>
+      <w:lvlJc w:val="left"/>
+      <w:pPr>
+        <w:tabs>
+          <w:tab w:val="num" w:pos="5760"/>
+        </w:tabs>
+        <w:ind w:left="5760" w:hanging="360"/>
+      </w:pPr>
+    </w:lvl>
+    <w:lvl w:ilvl="8" w:tentative="1">
+      <w:start w:val="1"/>
+      <w:numFmt w:val="decimal"/>
+      <w:lvlText w:val="%9."/>
+      <w:lvlJc w:val="left"/>
+      <w:pPr>
+        <w:tabs>
+          <w:tab w:val="num" w:pos="6480"/>
+        </w:tabs>
+        <w:ind w:left="6480" w:hanging="360"/>
+      </w:pPr>
+    </w:lvl>
+  </w:abstractNum>
+  <w:abstractNum w:abstractNumId="2" w15:restartNumberingAfterBreak="0">
+    <w:nsid w:val="53937CDD"/>
+    <w:multiLevelType w:val="multilevel"/>
+    <w:tmpl w:val="E766C668"/>
+    <w:lvl w:ilvl="0">
+      <w:start w:val="1"/>
+      <w:numFmt w:val="bullet"/>
+      <w:lvlText w:val=""/>
+      <w:lvlJc w:val="left"/>
+      <w:pPr>
+        <w:tabs>
+          <w:tab w:val="num" w:pos="720"/>
+        </w:tabs>
+        <w:ind w:left="720" w:hanging="360"/>
+      </w:pPr>
+      <w:rPr>
+        <w:rFonts w:ascii="Symbol" w:hAnsi="Symbol" w:hint="default"/>
+        <w:sz w:val="20"/>
+      </w:rPr>
+    </w:lvl>
+    <w:lvl w:ilvl="1" w:tentative="1">
+      <w:start w:val="1"/>
+      <w:numFmt w:val="bullet"/>
+      <w:lvlText w:val=""/>
+      <w:lvlJc w:val="left"/>
+      <w:pPr>
+        <w:tabs>
+          <w:tab w:val="num" w:pos="1440"/>
+        </w:tabs>
+        <w:ind w:left="1440" w:hanging="360"/>
+      </w:pPr>
+      <w:rPr>
+        <w:rFonts w:ascii="Symbol" w:hAnsi="Symbol" w:hint="default"/>
+        <w:sz w:val="20"/>
+      </w:rPr>
+    </w:lvl>
+    <w:lvl w:ilvl="2" w:tentative="1">
+      <w:start w:val="1"/>
+      <w:numFmt w:val="bullet"/>
+      <w:lvlText w:val=""/>
+      <w:lvlJc w:val="left"/>
+      <w:pPr>
+        <w:tabs>
+          <w:tab w:val="num" w:pos="2160"/>
+        </w:tabs>
+        <w:ind w:left="2160" w:hanging="360"/>
+      </w:pPr>
+      <w:rPr>
+        <w:rFonts w:ascii="Symbol" w:hAnsi="Symbol" w:hint="default"/>
+        <w:sz w:val="20"/>
+      </w:rPr>
+    </w:lvl>
+    <w:lvl w:ilvl="3" w:tentative="1">
+      <w:start w:val="1"/>
+      <w:numFmt w:val="bullet"/>
+      <w:lvlText w:val=""/>
+      <w:lvlJc w:val="left"/>
+      <w:pPr>
+        <w:tabs>
+          <w:tab w:val="num" w:pos="2880"/>
+        </w:tabs>
+        <w:ind w:left="2880" w:hanging="360"/>
+      </w:pPr>
+      <w:rPr>
+        <w:rFonts w:ascii="Symbol" w:hAnsi="Symbol" w:hint="default"/>
+        <w:sz w:val="20"/>
+      </w:rPr>
+    </w:lvl>
+    <w:lvl w:ilvl="4" w:tentative="1">
+      <w:start w:val="1"/>
+      <w:numFmt w:val="bullet"/>
+      <w:lvlText w:val=""/>
+      <w:lvlJc w:val="left"/>
+      <w:pPr>
+        <w:tabs>
+          <w:tab w:val="num" w:pos="3600"/>
+        </w:tabs>
+        <w:ind w:left="3600" w:hanging="360"/>
+      </w:pPr>
+      <w:rPr>
+        <w:rFonts w:ascii="Symbol" w:hAnsi="Symbol" w:hint="default"/>
+        <w:sz w:val="20"/>
+      </w:rPr>
+    </w:lvl>
+    <w:lvl w:ilvl="5" w:tentative="1">
+      <w:start w:val="1"/>
+      <w:numFmt w:val="bullet"/>
+      <w:lvlText w:val=""/>
+      <w:lvlJc w:val="left"/>
+      <w:pPr>
+        <w:tabs>
+          <w:tab w:val="num" w:pos="4320"/>
+        </w:tabs>
+        <w:ind w:left="4320" w:hanging="360"/>
+      </w:pPr>
+      <w:rPr>
+        <w:rFonts w:ascii="Symbol" w:hAnsi="Symbol" w:hint="default"/>
+        <w:sz w:val="20"/>
+      </w:rPr>
+    </w:lvl>
+    <w:lvl w:ilvl="6" w:tentative="1">
+      <w:start w:val="1"/>
+      <w:numFmt w:val="bullet"/>
+      <w:lvlText w:val=""/>
+      <w:lvlJc w:val="left"/>
+      <w:pPr>
+        <w:tabs>
+          <w:tab w:val="num" w:pos="5040"/>
+        </w:tabs>
+        <w:ind w:left="5040" w:hanging="360"/>
+      </w:pPr>
+      <w:rPr>
+        <w:rFonts w:ascii="Symbol" w:hAnsi="Symbol" w:hint="default"/>
+        <w:sz w:val="20"/>
+      </w:rPr>
+    </w:lvl>
+    <w:lvl w:ilvl="7" w:tentative="1">
+      <w:start w:val="1"/>
+      <w:numFmt w:val="bullet"/>
+      <w:lvlText w:val=""/>
+      <w:lvlJc w:val="left"/>
+      <w:pPr>
+        <w:tabs>
+          <w:tab w:val="num" w:pos="5760"/>
+        </w:tabs>
+        <w:ind w:left="5760" w:hanging="360"/>
+      </w:pPr>
+      <w:rPr>
+        <w:rFonts w:ascii="Symbol" w:hAnsi="Symbol" w:hint="default"/>
+        <w:sz w:val="20"/>
+      </w:rPr>
+    </w:lvl>
+    <w:lvl w:ilvl="8" w:tentative="1">
+      <w:start w:val="1"/>
+      <w:numFmt w:val="bullet"/>
+      <w:lvlText w:val=""/>
+      <w:lvlJc w:val="left"/>
+      <w:pPr>
+        <w:tabs>
+          <w:tab w:val="num" w:pos="6480"/>
+        </w:tabs>
+        <w:ind w:left="6480" w:hanging="360"/>
+      </w:pPr>
+      <w:rPr>
+        <w:rFonts w:ascii="Symbol" w:hAnsi="Symbol" w:hint="default"/>
+        <w:sz w:val="20"/>
+      </w:rPr>
+    </w:lvl>
+  </w:abstractNum>
+  <w:num w:numId="1" w16cid:durableId="1593589934">
+    <w:abstractNumId w:val="1"/>
+  </w:num>
+  <w:num w:numId="2" w16cid:durableId="304316316">
+    <w:abstractNumId w:val="0"/>
+  </w:num>
+  <w:num w:numId="3" w16cid:durableId="2090036544">
+    <w:abstractNumId w:val="2"/>
+  </w:num>
+</w:numbering>
 </file>
 
 <file path=word/styles.xml><?xml version="1.0" encoding="utf-8"?>
@@ -1074,7 +1747,6 @@
   <w:style w:type="character" w:default="1" w:styleId="DefaultParagraphFont">
     <w:name w:val="Default Paragraph Font"/>
     <w:uiPriority w:val="1"/>
-    <w:semiHidden/>
     <w:unhideWhenUsed/>
   </w:style>
   <w:style w:type="table" w:default="1" w:styleId="TableNormal">

</xml_diff>